<commit_message>
Day12-Visionary: guard missing asset and vision call, add project.md
Adds a File.Exists check before reading the sample image (so a missed
rebuild fails with a clear message instead of a raw
FileNotFoundException) and wraps the multimodal chat call in try/catch
since not every model accepts image content the same way. Also guards
a null response.Content. Syncs the docx's Complete Code listing and
replaces missing.md with project.md.
</commit_message>
<xml_diff>
--- a/Day12-Visionary.docx
+++ b/Day12-Visionary.docx
@@ -838,6 +838,118 @@
           <w:rFonts w:ascii="Consolas" w:hAnsi="Consolas"/>
           <w:sz w:val="19"/>
         </w:rPr>
+        <w:t xml:space="preserve">            if (!File.Exists(imagePath))</w:t>
+      </w:r>
+    </w:p>
+    <w:p>
+      <w:pPr>
+        <w:pStyle w:val="NoSpacing"/>
+        <w:rPr>
+          <w:rFonts w:ascii="Consolas" w:hAnsi="Consolas"/>
+          <w:sz w:val="19"/>
+        </w:rPr>
+      </w:pPr>
+      <w:r>
+        <w:rPr>
+          <w:rFonts w:ascii="Consolas" w:hAnsi="Consolas"/>
+          <w:sz w:val="19"/>
+        </w:rPr>
+        <w:t xml:space="preserve">            {</w:t>
+      </w:r>
+    </w:p>
+    <w:p>
+      <w:pPr>
+        <w:pStyle w:val="NoSpacing"/>
+        <w:rPr>
+          <w:rFonts w:ascii="Consolas" w:hAnsi="Consolas"/>
+          <w:sz w:val="19"/>
+        </w:rPr>
+      </w:pPr>
+      <w:r>
+        <w:rPr>
+          <w:rFonts w:ascii="Consolas" w:hAnsi="Consolas"/>
+          <w:sz w:val="19"/>
+        </w:rPr>
+        <w:t xml:space="preserve">                Console.WriteLine($"Could not find the sample image at: {imagePath}");</w:t>
+      </w:r>
+    </w:p>
+    <w:p>
+      <w:pPr>
+        <w:pStyle w:val="NoSpacing"/>
+        <w:rPr>
+          <w:rFonts w:ascii="Consolas" w:hAnsi="Consolas"/>
+          <w:sz w:val="19"/>
+        </w:rPr>
+      </w:pPr>
+      <w:r>
+        <w:rPr>
+          <w:rFonts w:ascii="Consolas" w:hAnsi="Consolas"/>
+          <w:sz w:val="19"/>
+        </w:rPr>
+        <w:t xml:space="preserve">                Console.WriteLine("Rebuild the project so the Assets\\sample-chart.png " +</w:t>
+      </w:r>
+    </w:p>
+    <w:p>
+      <w:pPr>
+        <w:pStyle w:val="NoSpacing"/>
+        <w:rPr>
+          <w:rFonts w:ascii="Consolas" w:hAnsi="Consolas"/>
+          <w:sz w:val="19"/>
+        </w:rPr>
+      </w:pPr>
+      <w:r>
+        <w:rPr>
+          <w:rFonts w:ascii="Consolas" w:hAnsi="Consolas"/>
+          <w:sz w:val="19"/>
+        </w:rPr>
+        <w:t xml:space="preserve">                    "CopyToOutputDirectory step in Visionary.csproj runs again.");</w:t>
+      </w:r>
+    </w:p>
+    <w:p>
+      <w:pPr>
+        <w:pStyle w:val="NoSpacing"/>
+        <w:rPr>
+          <w:rFonts w:ascii="Consolas" w:hAnsi="Consolas"/>
+          <w:sz w:val="19"/>
+        </w:rPr>
+      </w:pPr>
+      <w:r>
+        <w:rPr>
+          <w:rFonts w:ascii="Consolas" w:hAnsi="Consolas"/>
+          <w:sz w:val="19"/>
+        </w:rPr>
+        <w:t xml:space="preserve">                return;</w:t>
+      </w:r>
+    </w:p>
+    <w:p>
+      <w:pPr>
+        <w:pStyle w:val="NoSpacing"/>
+        <w:rPr>
+          <w:rFonts w:ascii="Consolas" w:hAnsi="Consolas"/>
+          <w:sz w:val="19"/>
+        </w:rPr>
+      </w:pPr>
+      <w:r>
+        <w:rPr>
+          <w:rFonts w:ascii="Consolas" w:hAnsi="Consolas"/>
+          <w:sz w:val="19"/>
+        </w:rPr>
+        <w:t xml:space="preserve">            }</w:t>
+      </w:r>
+    </w:p>
+    <w:p>
+      <w:pPr>
+        <w:pStyle w:val="NoSpacing"/>
+        <w:rPr>
+          <w:rFonts w:ascii="Consolas" w:hAnsi="Consolas"/>
+          <w:sz w:val="19"/>
+        </w:rPr>
+      </w:pPr>
+      <w:r>
+        <w:rPr>
+          <w:rFonts w:ascii="Consolas" w:hAnsi="Consolas"/>
+          <w:sz w:val="19"/>
+        </w:rPr>
         <w:t xml:space="preserve">            Console.WriteLine($"Analyzing Image {imagePath}");</w:t>
       </w:r>
     </w:p>
@@ -1059,7 +1171,152 @@
           <w:rFonts w:ascii="Consolas" w:hAnsi="Consolas"/>
           <w:sz w:val="19"/>
         </w:rPr>
-        <w:t xml:space="preserve">            var response = await chatService.GetChatMessageContentAsync(chatHistory, settings, kernel);</w:t>
+        <w:t xml:space="preserve">            ChatMessageContent response;</w:t>
+      </w:r>
+    </w:p>
+    <w:p>
+      <w:pPr>
+        <w:pStyle w:val="NoSpacing"/>
+        <w:rPr>
+          <w:rFonts w:ascii="Consolas" w:hAnsi="Consolas"/>
+          <w:sz w:val="19"/>
+        </w:rPr>
+      </w:pPr>
+      <w:r>
+        <w:rPr>
+          <w:rFonts w:ascii="Consolas" w:hAnsi="Consolas"/>
+          <w:sz w:val="19"/>
+        </w:rPr>
+        <w:t xml:space="preserve">            try</w:t>
+      </w:r>
+    </w:p>
+    <w:p>
+      <w:pPr>
+        <w:pStyle w:val="NoSpacing"/>
+        <w:rPr>
+          <w:rFonts w:ascii="Consolas" w:hAnsi="Consolas"/>
+          <w:sz w:val="19"/>
+        </w:rPr>
+      </w:pPr>
+      <w:r>
+        <w:rPr>
+          <w:rFonts w:ascii="Consolas" w:hAnsi="Consolas"/>
+          <w:sz w:val="19"/>
+        </w:rPr>
+        <w:lastRenderedPageBreak/>
+        <w:t xml:space="preserve">            {</w:t>
+      </w:r>
+    </w:p>
+    <w:p>
+      <w:pPr>
+        <w:pStyle w:val="NoSpacing"/>
+        <w:rPr>
+          <w:rFonts w:ascii="Consolas" w:hAnsi="Consolas"/>
+          <w:sz w:val="19"/>
+        </w:rPr>
+      </w:pPr>
+      <w:r>
+        <w:rPr>
+          <w:rFonts w:ascii="Consolas" w:hAnsi="Consolas"/>
+          <w:sz w:val="19"/>
+        </w:rPr>
+        <w:t xml:space="preserve">                response = await chatService.GetChatMessageContentAsync(chatHistory, settings, kernel);</w:t>
+      </w:r>
+    </w:p>
+    <w:p>
+      <w:pPr>
+        <w:pStyle w:val="NoSpacing"/>
+        <w:rPr>
+          <w:rFonts w:ascii="Consolas" w:hAnsi="Consolas"/>
+          <w:sz w:val="19"/>
+        </w:rPr>
+      </w:pPr>
+      <w:r>
+        <w:rPr>
+          <w:rFonts w:ascii="Consolas" w:hAnsi="Consolas"/>
+          <w:sz w:val="19"/>
+        </w:rPr>
+        <w:t xml:space="preserve">            }</w:t>
+      </w:r>
+    </w:p>
+    <w:p>
+      <w:pPr>
+        <w:pStyle w:val="NoSpacing"/>
+        <w:rPr>
+          <w:rFonts w:ascii="Consolas" w:hAnsi="Consolas"/>
+          <w:sz w:val="19"/>
+        </w:rPr>
+      </w:pPr>
+      <w:r>
+        <w:rPr>
+          <w:rFonts w:ascii="Consolas" w:hAnsi="Consolas"/>
+          <w:sz w:val="19"/>
+        </w:rPr>
+        <w:t xml:space="preserve">            catch (Exception ex)</w:t>
+      </w:r>
+    </w:p>
+    <w:p>
+      <w:pPr>
+        <w:pStyle w:val="NoSpacing"/>
+        <w:rPr>
+          <w:rFonts w:ascii="Consolas" w:hAnsi="Consolas"/>
+          <w:sz w:val="19"/>
+        </w:rPr>
+      </w:pPr>
+      <w:r>
+        <w:rPr>
+          <w:rFonts w:ascii="Consolas" w:hAnsi="Consolas"/>
+          <w:sz w:val="19"/>
+        </w:rPr>
+        <w:t xml:space="preserve">            {</w:t>
+      </w:r>
+    </w:p>
+    <w:p>
+      <w:pPr>
+        <w:pStyle w:val="NoSpacing"/>
+        <w:rPr>
+          <w:rFonts w:ascii="Consolas" w:hAnsi="Consolas"/>
+          <w:sz w:val="19"/>
+        </w:rPr>
+      </w:pPr>
+      <w:r>
+        <w:rPr>
+          <w:rFonts w:ascii="Consolas" w:hAnsi="Consolas"/>
+          <w:sz w:val="19"/>
+        </w:rPr>
+        <w:t xml:space="preserve">                Console.WriteLine($"\nThe model rejected this image request: {ex.Message}");</w:t>
+      </w:r>
+    </w:p>
+    <w:p>
+      <w:pPr>
+        <w:pStyle w:val="NoSpacing"/>
+        <w:rPr>
+          <w:rFonts w:ascii="Consolas" w:hAnsi="Consolas"/>
+          <w:sz w:val="19"/>
+        </w:rPr>
+      </w:pPr>
+      <w:r>
+        <w:rPr>
+          <w:rFonts w:ascii="Consolas" w:hAnsi="Consolas"/>
+          <w:sz w:val="19"/>
+        </w:rPr>
+        <w:t xml:space="preserve">                return;</w:t>
+      </w:r>
+    </w:p>
+    <w:p>
+      <w:pPr>
+        <w:pStyle w:val="NoSpacing"/>
+        <w:rPr>
+          <w:rFonts w:ascii="Consolas" w:hAnsi="Consolas"/>
+          <w:sz w:val="19"/>
+        </w:rPr>
+      </w:pPr>
+      <w:r>
+        <w:rPr>
+          <w:rFonts w:ascii="Consolas" w:hAnsi="Consolas"/>
+          <w:sz w:val="19"/>
+        </w:rPr>
+        <w:t xml:space="preserve">            }</w:t>
       </w:r>
     </w:p>
     <w:p>
@@ -1116,7 +1373,7 @@
           <w:rFonts w:ascii="Consolas" w:hAnsi="Consolas"/>
           <w:sz w:val="19"/>
         </w:rPr>
-        <w:t xml:space="preserve">            Console.WriteLine(response.Content);</w:t>
+        <w:t xml:space="preserve">            Console.WriteLine(response.Content ?? "(The model returned no analysis for this image.)");</w:t>
       </w:r>
     </w:p>
     <w:p>
@@ -1217,6 +1474,7 @@
         <w:rPr>
           <w:b/>
         </w:rPr>
+        <w:lastRenderedPageBreak/>
         <w:t>Step 4: Building a Multimodal Message.</w:t>
       </w:r>
       <w:r>
@@ -1232,11 +1490,7 @@
         <w:t>Step 5: A Deliberately Warmer Temperature.</w:t>
       </w:r>
       <w:r>
-        <w:t xml:space="preserve"> `Temperature = 0.4` is a step up from the near-zero settings seen in Days 10 and 11. The code comment explains why: multimodal </w:t>
-      </w:r>
-      <w:r>
-        <w:lastRenderedPageBreak/>
-        <w:t>description tasks benefit from a bit of linguistic variety and creative phrasing when describing what's visually present, whereas tasks like code generation or critique benefit from suppressing that same variety. This lesson reinforces that temperature isn't a single "correct" setting — it's tuned to the nature of the task.</w:t>
+        <w:t xml:space="preserve"> `Temperature = 0.4` is a step up from the near-zero settings seen in Days 10 and 11. The code comment explains why: multimodal description tasks benefit from a bit of linguistic variety and creative phrasing when describing what's visually present, whereas tasks like code generation or critique benefit from suppressing that same variety. This lesson reinforces that temperature isn't a single "correct" setting — it's tuned to the nature of the task.</w:t>
       </w:r>
     </w:p>
     <w:p/>

</xml_diff>